<commit_message>
✨ Add centered page-number footer to docx output
</commit_message>
<xml_diff>
--- a/templates/reference.docx
+++ b/templates/reference.docx
@@ -383,6 +383,7 @@
       </w:r>
     </w:p>
     <w:sectPr>
+      <w:footerReference w:type="default" r:id="rId50"/>
       <w:pgSz w:w="11906" w:h="16838"/>
       <w:pgMar w:top="1417" w:right="1417" w:bottom="1417" w:left="1417" w:header="720" w:footer="720" w:gutter="0"/>
     </w:sectPr>
@@ -392,6 +393,29 @@
 
 <file path=word/comments.xml><?xml version="1.0" encoding="utf-8"?>
 <w:comments xmlns:w="http://schemas.openxmlformats.org/wordprocessingml/2006/main" xmlns:m="http://schemas.openxmlformats.org/officeDocument/2006/math" xmlns:r="http://schemas.openxmlformats.org/officeDocument/2006/relationships" xmlns:o="urn:schemas-microsoft-com:office:office" xmlns:v="urn:schemas-microsoft-com:vml" xmlns:w10="urn:schemas-microsoft-com:office:word" xmlns:a="http://schemas.openxmlformats.org/drawingml/2006/main" xmlns:pic="http://schemas.openxmlformats.org/drawingml/2006/picture" xmlns:wp="http://schemas.openxmlformats.org/drawingml/2006/wordprocessingDrawing"/>
+</file>
+
+<file path=word/footer1.xml><?xml version="1.0" encoding="utf-8"?>
+<w:ftr xmlns:w="http://schemas.openxmlformats.org/wordprocessingml/2006/main">
+  <w:p>
+    <w:pPr>
+      <w:jc w:val="center"/>
+    </w:pPr>
+    <w:fldSimple w:instr=" PAGE ">
+      <w:r>
+        <w:t>1</w:t>
+      </w:r>
+    </w:fldSimple>
+    <w:r>
+      <w:t>/</w:t>
+    </w:r>
+    <w:fldSimple w:instr=" NUMPAGES ">
+      <w:r>
+        <w:t>1</w:t>
+      </w:r>
+    </w:fldSimple>
+  </w:p>
+</w:ftr>
 </file>
 
 <file path=word/footnotes.xml><?xml version="1.0" encoding="utf-8"?>

</xml_diff>

<commit_message>
✨ Render task lists as clickable checkboxes in docx output
Pandoc emits task list items as bullets whose text starts with a ☐/☒
glyph, so Word showed a bullet followed by a box. A new docx-only Lua
filter replaces each item with a bullet-free Checklist paragraph holding
a real Word checkbox content control, pre-checked for "- [x]" items.
Items that are not task items keep their bullet. PDF output is untouched.
</commit_message>
<xml_diff>
--- a/templates/reference.docx
+++ b/templates/reference.docx
@@ -1040,6 +1040,15 @@
     <w:pPr>
       <w:jc w:val="center"/>
       <w:spacing w:before="3000" w:after="600"/>
+    </w:pPr>
+  </w:style>
+  <w:style w:type="paragraph" w:customStyle="1" w:styleId="Checklist">
+    <w:name w:val="Checklist"/>
+    <w:basedOn w:val="BodyText"/>
+    <w:pPr>
+      <w:spacing w:before="0" w:after="60"/>
+      <w:ind w:left="360"/>
+      <w:contextualSpacing/>
     </w:pPr>
   </w:style>
   <w:style w:type="paragraph" w:customStyle="1" w:styleId="AlertNote">

</xml_diff>

<commit_message>
✨ Ship the docx table of contents already filled in
Word only populated the TOC field on demand, so readers had to select all
and press F9. Asking for a field update via w:updateFields only produced a
prompt that left the TOC empty when declined, so the filter now computes the
entries at conversion time and stores them as the field result: numbered,
indented per level and hyperlinked to their heading, so the outline shows on
open with no interaction. The field stays a real TOC, so refreshing it adds
the page numbers only Word can lay out.
</commit_message>
<xml_diff>
--- a/templates/reference.docx
+++ b/templates/reference.docx
@@ -1049,6 +1049,39 @@
       <w:spacing w:before="0" w:after="60"/>
       <w:ind w:left="360"/>
       <w:contextualSpacing/>
+    </w:pPr>
+  </w:style>
+  <w:style w:type="paragraph" w:customStyle="1" w:styleId="TOC1">
+    <w:name w:val="toc 1"/>
+    <w:basedOn w:val="BodyText"/>
+    <w:pPr>
+      <w:tabs>
+        <w:tab w:val="right" w:leader="dot" w:pos="9071"/>
+      </w:tabs>
+      <w:spacing w:before="0" w:after="60"/>
+      <w:ind w:left="0"/>
+    </w:pPr>
+  </w:style>
+  <w:style w:type="paragraph" w:customStyle="1" w:styleId="TOC2">
+    <w:name w:val="toc 2"/>
+    <w:basedOn w:val="BodyText"/>
+    <w:pPr>
+      <w:tabs>
+        <w:tab w:val="right" w:leader="dot" w:pos="9071"/>
+      </w:tabs>
+      <w:spacing w:before="0" w:after="60"/>
+      <w:ind w:left="240"/>
+    </w:pPr>
+  </w:style>
+  <w:style w:type="paragraph" w:customStyle="1" w:styleId="TOC3">
+    <w:name w:val="toc 3"/>
+    <w:basedOn w:val="BodyText"/>
+    <w:pPr>
+      <w:tabs>
+        <w:tab w:val="right" w:leader="dot" w:pos="9071"/>
+      </w:tabs>
+      <w:spacing w:before="0" w:after="60"/>
+      <w:ind w:left="480"/>
     </w:pPr>
   </w:style>
   <w:style w:type="paragraph" w:customStyle="1" w:styleId="AlertNote">

</xml_diff>

<commit_message>
✨ Draw black gridlines around every table cell in docx
Pandoc's default Table style only underlines the header row, which left
the body borderless in Word. Add plain 0.5pt black borders on the six
edges of the reference style.
</commit_message>
<xml_diff>
--- a/templates/reference.docx
+++ b/templates/reference.docx
@@ -912,6 +912,14 @@
     <w:qFormat/>
     <w:tblPr>
       <w:tblInd w:w="0" w:type="dxa"/>
+      <w:tblBorders>
+        <w:top w:val="single" w:sz="4" w:space="0" w:color="000000"/>
+        <w:left w:val="single" w:sz="4" w:space="0" w:color="000000"/>
+        <w:bottom w:val="single" w:sz="4" w:space="0" w:color="000000"/>
+        <w:right w:val="single" w:sz="4" w:space="0" w:color="000000"/>
+        <w:insideH w:val="single" w:sz="4" w:space="0" w:color="000000"/>
+        <w:insideV w:val="single" w:sz="4" w:space="0" w:color="000000"/>
+      </w:tblBorders>
       <w:tblCellMar>
         <w:top w:w="0" w:type="dxa"/>
         <w:left w:w="108" w:type="dxa"/>

</xml_diff>